<commit_message>
File 36 downloaded references and relink plan-2
- Rename the PDFs uploaded to Plan_fen/External References to the
  "YYYY - Title.pdf" convention, file them in topic folders 1-4 and
  remove the staging folder (one duplicate dropped)
- plan-2: 63 of 76 references now link to local PDFs; bibliographic
  details confirmed from the PDFs (Gu et al. is JM 2024, 88(4), 64-83;
  Feng et al. pages; five DOIs no longer flagged)
- plan-2 download list: 13 references still missing, 1 preprint to
  replace, and 13 review candidates now downloaded and filed
- Replace the folder-count record with 1024-0000 (237 PDFs, +36), which
  now counts plan-1 and plan-2 citations separately (new counts.py)

Co-Authored-By: Claude Opus 5.5 <noreply@anthropic.com>
Claude-Session: https://claude.ai/code/session_016FPnR4vKwrHGHQQfjHQt5q
</commit_message>
<xml_diff>
--- a/Plan_fen/plan-2/plan-2_兩年期研究計畫書.docx
+++ b/Plan_fen/plan-2/plan-2_兩年期研究計畫書.docx
@@ -101,7 +101,7 @@
             <w:rStyle w:val="Hyperlink"/>
             <w:rFonts w:ascii="Times New Roman" w:hAnsi="Times New Roman" w:eastAsia="標楷體" w:cs="Times New Roman"/>
           </w:rPr>
-          <w:t xml:space="preserve">Gu et al., 2023</w:t>
+          <w:t xml:space="preserve">Gu et al., 2024</w:t>
         </w:r>
       </w:hyperlink>
       <w:r>
@@ -977,7 +977,7 @@
             <w:rStyle w:val="Hyperlink"/>
             <w:rFonts w:ascii="Times New Roman" w:hAnsi="Times New Roman" w:eastAsia="標楷體" w:cs="Times New Roman"/>
           </w:rPr>
-          <w:t xml:space="preserve">Gu et al., 2023</w:t>
+          <w:t xml:space="preserve">Gu et al., 2024</w:t>
         </w:r>
       </w:hyperlink>
       <w:r>
@@ -5153,7 +5153,7 @@
                   <w:sz w:val="19"/>
                   <w:szCs w:val="19"/>
                 </w:rPr>
-                <w:t xml:space="preserve">Gu et al. (2023)</w:t>
+                <w:t xml:space="preserve">Gu et al. (2024)</w:t>
               </w:r>
             </w:hyperlink>
             <w:r>
@@ -26112,7 +26112,7 @@
         <w:rPr>
           <w:rFonts w:ascii="Times New Roman" w:hAnsi="Times New Roman" w:eastAsia="標楷體" w:cs="Times New Roman"/>
         </w:rPr>
-        <w:t xml:space="preserve">(12).</w:t>
+        <w:t xml:space="preserve">(12), 3978–3997.</w:t>
       </w:r>
     </w:p>
     <w:p>
@@ -26503,7 +26503,7 @@
         <w:rPr>
           <w:rFonts w:ascii="Times New Roman" w:hAnsi="Times New Roman" w:eastAsia="標楷體" w:cs="Times New Roman"/>
         </w:rPr>
-        <w:t xml:space="preserve">Gu, X., Zhang, X., &amp; Kannan, P. K. (2023). </w:t>
+        <w:t xml:space="preserve">Gu, X., Zhang, X., &amp; Kannan, P. K. (2024). </w:t>
       </w:r>
       <w:hyperlink r:id="rIdL3" w:history="1">
         <w:r>
@@ -26526,13 +26526,13 @@
           <w:i/>
           <w:iCs/>
         </w:rPr>
-        <w:t xml:space="preserve">Journal of Marketing</w:t>
-      </w:r>
-      <w:r>
-        <w:rPr>
-          <w:rFonts w:ascii="Times New Roman" w:hAnsi="Times New Roman" w:eastAsia="標楷體" w:cs="Times New Roman"/>
-        </w:rPr>
-        <w:t xml:space="preserve">. Advance online publication.</w:t>
+        <w:t xml:space="preserve">Journal of Marketing, 88</w:t>
+      </w:r>
+      <w:r>
+        <w:rPr>
+          <w:rFonts w:ascii="Times New Roman" w:hAnsi="Times New Roman" w:eastAsia="標楷體" w:cs="Times New Roman"/>
+        </w:rPr>
+        <w:t xml:space="preserve">(4), 64–83.</w:t>
       </w:r>
     </w:p>
     <w:p>

</xml_diff>